<commit_message>
add link to final report
</commit_message>
<xml_diff>
--- a/reports/final_report.docx
+++ b/reports/final_report.docx
@@ -91,12 +91,57 @@
       </w:r>
     </w:p>
     <w:p>
+      <w:pPr>
+        <w:spacing w:before="100" w:beforeAutospacing="1" w:after="100" w:afterAutospacing="1"/>
+        <w:outlineLvl w:val="1"/>
+        <w:rPr>
+          <w:color w:val="000000"/>
+          <w:sz w:val="27"/>
+          <w:szCs w:val="27"/>
+        </w:rPr>
+      </w:pPr>
+      <w:r>
+        <w:rPr>
+          <w:color w:val="000000"/>
+          <w:sz w:val="27"/>
+          <w:szCs w:val="27"/>
+        </w:rPr>
+        <w:t xml:space="preserve">Github repository link : </w:t>
+      </w:r>
+      <w:hyperlink r:id="rId5" w:history="1">
+        <w:r>
+          <w:rPr>
+            <w:rStyle w:val="Hyperlink"/>
+            <w:sz w:val="27"/>
+            <w:szCs w:val="27"/>
+          </w:rPr>
+          <w:t>https://github.com/chianyou/msin009</w:t>
+        </w:r>
+        <w:r>
+          <w:rPr>
+            <w:rStyle w:val="Hyperlink"/>
+            <w:sz w:val="27"/>
+            <w:szCs w:val="27"/>
+          </w:rPr>
+          <w:t>7</w:t>
+        </w:r>
+        <w:r>
+          <w:rPr>
+            <w:rStyle w:val="Hyperlink"/>
+            <w:sz w:val="27"/>
+            <w:szCs w:val="27"/>
+          </w:rPr>
+          <w:t>-predictive-analytics</w:t>
+        </w:r>
+      </w:hyperlink>
+    </w:p>
+    <w:p>
       <w:r>
         <w:rPr>
           <w:noProof/>
           <w14:ligatures w14:val="standardContextual"/>
         </w:rPr>
-        <w:pict w14:anchorId="69FE273E">
+        <w:pict w14:anchorId="132411EB">
           <v:rect id="_x0000_i1031" alt="" style="width:451.3pt;height:.05pt;mso-width-percent:0;mso-height-percent:0;mso-width-percent:0;mso-height-percent:0" o:hralign="center" o:hrstd="t" o:hr="t" fillcolor="#a0a0a0" stroked="f"/>
         </w:pict>
       </w:r>
@@ -305,6 +350,7 @@
         <w:rPr>
           <w:color w:val="000000"/>
         </w:rPr>
+        <w:lastRenderedPageBreak/>
         <w:t xml:space="preserve">In addition to performance considerations, interpretability </w:t>
       </w:r>
       <w:r>
@@ -349,7 +395,6 @@
           <w:sz w:val="27"/>
           <w:szCs w:val="27"/>
         </w:rPr>
-        <w:lastRenderedPageBreak/>
         <w:t>1.4 Assumptions, Limitations, and Agent Plan</w:t>
       </w:r>
     </w:p>
@@ -388,7 +433,7 @@
           <w:noProof/>
           <w14:ligatures w14:val="standardContextual"/>
         </w:rPr>
-        <w:pict w14:anchorId="46BEC9CA">
+        <w:pict w14:anchorId="5E3227EA">
           <v:rect id="_x0000_i1030" alt="" style="width:451.3pt;height:.05pt;mso-width-percent:0;mso-height-percent:0;mso-width-percent:0;mso-height-percent:0" o:hralign="center" o:hrstd="t" o:hr="t" fillcolor="#a0a0a0" stroked="f"/>
         </w:pict>
       </w:r>
@@ -588,6 +633,7 @@
           <w:color w:val="000000"/>
           <w14:ligatures w14:val="standardContextual"/>
         </w:rPr>
+        <w:lastRenderedPageBreak/>
         <w:drawing>
           <wp:inline distT="0" distB="0" distL="0" distR="0" wp14:anchorId="5BB9FC41" wp14:editId="6E49AE2D">
             <wp:extent cx="5731510" cy="2804795"/>
@@ -604,7 +650,7 @@
                     <pic:cNvPicPr/>
                   </pic:nvPicPr>
                   <pic:blipFill>
-                    <a:blip r:embed="rId5" cstate="print">
+                    <a:blip r:embed="rId6" cstate="print">
                       <a:extLst>
                         <a:ext uri="{28A0092B-C50C-407E-A947-70E740481C1C}">
                           <a14:useLocalDpi xmlns:a14="http://schemas.microsoft.com/office/drawing/2010/main" val="0"/>
@@ -677,7 +723,6 @@
         <w:rPr>
           <w:color w:val="000000"/>
         </w:rPr>
-        <w:lastRenderedPageBreak/>
         <w:t>This represents low-risk missingness and can be addressed through median imputation without introducing major bias. The issue primarily originated from data type inconsistencies (blank strings converted to NaN), highlighting the importance of preprocessing validation.</w:t>
       </w:r>
     </w:p>
@@ -743,7 +788,7 @@
                     <pic:cNvPicPr/>
                   </pic:nvPicPr>
                   <pic:blipFill>
-                    <a:blip r:embed="rId6" cstate="print">
+                    <a:blip r:embed="rId7" cstate="print">
                       <a:extLst>
                         <a:ext uri="{28A0092B-C50C-407E-A947-70E740481C1C}">
                           <a14:useLocalDpi xmlns:a14="http://schemas.microsoft.com/office/drawing/2010/main" val="0"/>
@@ -944,7 +989,14 @@
         <w:rPr>
           <w:color w:val="000000"/>
         </w:rPr>
-        <w:t>are more common in churned users, while churned customers also exhibit shorter tenure. As these extremes carry business meaning, outliers were retained, with robustness checks (e.g., winsorisation or log transformation) considered during modelling.</w:t>
+        <w:t xml:space="preserve">are more common in churned users, while churned customers also exhibit shorter tenure. As these extremes carry </w:t>
+      </w:r>
+      <w:r>
+        <w:rPr>
+          <w:color w:val="000000"/>
+        </w:rPr>
+        <w:lastRenderedPageBreak/>
+        <w:t>business meaning, outliers were retained, with robustness checks (e.g., winsorisation or log transformation) considered during modelling.</w:t>
       </w:r>
     </w:p>
     <w:p>
@@ -1084,9 +1136,8 @@
           <w:noProof/>
           <w:color w:val="000000"/>
         </w:rPr>
-        <w:lastRenderedPageBreak/>
         <w:drawing>
-          <wp:inline distT="0" distB="0" distL="0" distR="0" wp14:anchorId="7BBEF0B2" wp14:editId="4348D712">
+          <wp:inline distT="0" distB="0" distL="0" distR="0" wp14:anchorId="7BBEF0B2" wp14:editId="34ADA059">
             <wp:extent cx="4419600" cy="3505200"/>
             <wp:effectExtent l="0" t="0" r="0" b="0"/>
             <wp:docPr id="1960795742" name="Picture 1" descr="A graph with blue squares&#10;&#10;AI-generated content may be incorrect."/>
@@ -1101,7 +1152,7 @@
                     <pic:cNvPicPr/>
                   </pic:nvPicPr>
                   <pic:blipFill>
-                    <a:blip r:embed="rId7" cstate="print">
+                    <a:blip r:embed="rId8" cstate="print">
                       <a:extLst>
                         <a:ext uri="{28A0092B-C50C-407E-A947-70E740481C1C}">
                           <a14:useLocalDpi xmlns:a14="http://schemas.microsoft.com/office/drawing/2010/main" val="0"/>
@@ -1196,6 +1247,7 @@
           <w:sz w:val="27"/>
           <w:szCs w:val="27"/>
         </w:rPr>
+        <w:lastRenderedPageBreak/>
         <w:t>2.</w:t>
       </w:r>
       <w:r>
@@ -1266,7 +1318,7 @@
           <w:noProof/>
         </w:rPr>
         <w:drawing>
-          <wp:inline distT="0" distB="0" distL="0" distR="0" wp14:anchorId="5F08D7EB" wp14:editId="0454C651">
+          <wp:inline distT="0" distB="0" distL="0" distR="0" wp14:anchorId="5F08D7EB" wp14:editId="575D630C">
             <wp:extent cx="5731510" cy="3215005"/>
             <wp:effectExtent l="0" t="0" r="0" b="0"/>
             <wp:docPr id="1057499957" name="Picture 3" descr="A graph of a graph with a number of columns&#10;&#10;AI-generated content may be incorrect."/>
@@ -1278,101 +1330,6 @@
                 <pic:pic xmlns:pic="http://schemas.openxmlformats.org/drawingml/2006/picture">
                   <pic:nvPicPr>
                     <pic:cNvPr id="1057499957" name="Picture 3" descr="A graph of a graph with a number of columns&#10;&#10;AI-generated content may be incorrect."/>
-                    <pic:cNvPicPr/>
-                  </pic:nvPicPr>
-                  <pic:blipFill>
-                    <a:blip r:embed="rId8" cstate="print">
-                      <a:extLst>
-                        <a:ext uri="{28A0092B-C50C-407E-A947-70E740481C1C}">
-                          <a14:useLocalDpi xmlns:a14="http://schemas.microsoft.com/office/drawing/2010/main" val="0"/>
-                        </a:ext>
-                      </a:extLst>
-                    </a:blip>
-                    <a:stretch>
-                      <a:fillRect/>
-                    </a:stretch>
-                  </pic:blipFill>
-                  <pic:spPr>
-                    <a:xfrm>
-                      <a:off x="0" y="0"/>
-                      <a:ext cx="5731510" cy="3215005"/>
-                    </a:xfrm>
-                    <a:prstGeom prst="rect">
-                      <a:avLst/>
-                    </a:prstGeom>
-                  </pic:spPr>
-                </pic:pic>
-              </a:graphicData>
-            </a:graphic>
-          </wp:inline>
-        </w:drawing>
-      </w:r>
-    </w:p>
-    <w:p>
-      <w:pPr>
-        <w:jc w:val="center"/>
-        <w:rPr>
-          <w:rStyle w:val="apple-converted-space"/>
-          <w:rFonts w:eastAsiaTheme="majorEastAsia"/>
-          <w:color w:val="000000"/>
-        </w:rPr>
-      </w:pPr>
-      <w:r>
-        <w:rPr>
-          <w:color w:val="000000"/>
-        </w:rPr>
-        <w:t xml:space="preserve">▲ </w:t>
-      </w:r>
-      <w:r>
-        <w:rPr>
-          <w:color w:val="000000"/>
-        </w:rPr>
-        <w:t>(</w:t>
-      </w:r>
-      <w:r>
-        <w:rPr>
-          <w:rStyle w:val="Emphasis"/>
-          <w:rFonts w:eastAsiaTheme="majorEastAsia"/>
-          <w:color w:val="000000"/>
-        </w:rPr>
-        <w:t>04_churn_pct_by_contract.png</w:t>
-      </w:r>
-      <w:r>
-        <w:rPr>
-          <w:rStyle w:val="apple-converted-space"/>
-          <w:rFonts w:eastAsiaTheme="majorEastAsia"/>
-          <w:color w:val="000000"/>
-        </w:rPr>
-        <w:t>)</w:t>
-      </w:r>
-    </w:p>
-    <w:p>
-      <w:pPr>
-        <w:jc w:val="center"/>
-      </w:pPr>
-    </w:p>
-    <w:p>
-      <w:pPr>
-        <w:jc w:val="center"/>
-      </w:pPr>
-      <w:r>
-        <w:rPr>
-          <w:noProof/>
-        </w:rPr>
-        <w:lastRenderedPageBreak/>
-        <w:drawing>
-          <wp:inline distT="0" distB="0" distL="0" distR="0" wp14:anchorId="61550FE4" wp14:editId="1F80378D">
-            <wp:extent cx="5731510" cy="3215005"/>
-            <wp:effectExtent l="0" t="0" r="0" b="0"/>
-            <wp:docPr id="635844195" name="Picture 4" descr="A graph of blue and orange bars&#10;&#10;AI-generated content may be incorrect."/>
-            <wp:cNvGraphicFramePr>
-              <a:graphicFrameLocks xmlns:a="http://schemas.openxmlformats.org/drawingml/2006/main" noChangeAspect="1"/>
-            </wp:cNvGraphicFramePr>
-            <a:graphic xmlns:a="http://schemas.openxmlformats.org/drawingml/2006/main">
-              <a:graphicData uri="http://schemas.openxmlformats.org/drawingml/2006/picture">
-                <pic:pic xmlns:pic="http://schemas.openxmlformats.org/drawingml/2006/picture">
-                  <pic:nvPicPr>
-                    <pic:cNvPr id="635844195" name="Picture 4" descr="A graph of blue and orange bars&#10;&#10;AI-generated content may be incorrect."/>
                     <pic:cNvPicPr/>
                   </pic:nvPicPr>
                   <pic:blipFill>
@@ -1405,38 +1362,37 @@
     </w:p>
     <w:p>
       <w:pPr>
-        <w:pStyle w:val="NormalWeb"/>
         <w:jc w:val="center"/>
         <w:rPr>
-          <w:color w:val="000000"/>
-        </w:rPr>
-      </w:pPr>
+          <w:rStyle w:val="apple-converted-space"/>
+          <w:rFonts w:eastAsiaTheme="majorEastAsia"/>
+          <w:color w:val="000000"/>
+        </w:rPr>
+      </w:pPr>
+      <w:r>
+        <w:rPr>
+          <w:color w:val="000000"/>
+        </w:rPr>
+        <w:t xml:space="preserve">▲ </w:t>
+      </w:r>
+      <w:r>
+        <w:rPr>
+          <w:color w:val="000000"/>
+        </w:rPr>
+        <w:t>(</w:t>
+      </w:r>
       <w:r>
         <w:rPr>
           <w:rStyle w:val="Emphasis"/>
           <w:rFonts w:eastAsiaTheme="majorEastAsia"/>
           <w:color w:val="000000"/>
         </w:rPr>
-        <w:t xml:space="preserve">▲ </w:t>
-      </w:r>
-      <w:r>
-        <w:rPr>
-          <w:rStyle w:val="Emphasis"/>
+        <w:t>04_churn_pct_by_contract.png</w:t>
+      </w:r>
+      <w:r>
+        <w:rPr>
+          <w:rStyle w:val="apple-converted-space"/>
           <w:rFonts w:eastAsiaTheme="majorEastAsia"/>
-          <w:color w:val="000000"/>
-        </w:rPr>
-        <w:t>(</w:t>
-      </w:r>
-      <w:r>
-        <w:rPr>
-          <w:rStyle w:val="Emphasis"/>
-          <w:rFonts w:eastAsiaTheme="majorEastAsia"/>
-          <w:color w:val="000000"/>
-        </w:rPr>
-        <w:t>05_counts_contract_vs_churn.png</w:t>
-      </w:r>
-      <w:r>
-        <w:rPr>
           <w:color w:val="000000"/>
         </w:rPr>
         <w:t>)</w:t>
@@ -1444,153 +1400,22 @@
     </w:p>
     <w:p>
       <w:pPr>
-        <w:pStyle w:val="NormalWeb"/>
-        <w:numPr>
-          <w:ilvl w:val="0"/>
-          <w:numId w:val="31"/>
-        </w:numPr>
-        <w:rPr>
-          <w:color w:val="000000"/>
-        </w:rPr>
-      </w:pPr>
-      <w:r>
-        <w:rPr>
-          <w:color w:val="000000"/>
-        </w:rPr>
-        <w:t>Month-to-month:</w:t>
-      </w:r>
-      <w:r>
-        <w:rPr>
-          <w:rStyle w:val="apple-converted-space"/>
-          <w:rFonts w:eastAsiaTheme="majorEastAsia"/>
-          <w:color w:val="000000"/>
-        </w:rPr>
-        <w:t> </w:t>
-      </w:r>
-      <w:r>
-        <w:rPr>
-          <w:rStyle w:val="Strong"/>
-          <w:rFonts w:eastAsiaTheme="majorEastAsia"/>
-          <w:color w:val="000000"/>
-        </w:rPr>
-        <w:t>42.71% churn</w:t>
-      </w:r>
+        <w:jc w:val="center"/>
+      </w:pPr>
     </w:p>
     <w:p>
       <w:pPr>
-        <w:pStyle w:val="NormalWeb"/>
-        <w:numPr>
-          <w:ilvl w:val="0"/>
-          <w:numId w:val="31"/>
-        </w:numPr>
-        <w:rPr>
-          <w:color w:val="000000"/>
-        </w:rPr>
-      </w:pPr>
-      <w:r>
-        <w:rPr>
-          <w:color w:val="000000"/>
-        </w:rPr>
-        <w:t>One-year: 11.27%</w:t>
-      </w:r>
-    </w:p>
-    <w:p>
-      <w:pPr>
-        <w:pStyle w:val="NormalWeb"/>
-        <w:numPr>
-          <w:ilvl w:val="0"/>
-          <w:numId w:val="31"/>
-        </w:numPr>
-        <w:rPr>
-          <w:color w:val="000000"/>
-        </w:rPr>
-      </w:pPr>
-      <w:r>
-        <w:rPr>
-          <w:color w:val="000000"/>
-        </w:rPr>
-        <w:t>Two-year: 2.83%</w:t>
-      </w:r>
-    </w:p>
-    <w:p>
-      <w:pPr>
-        <w:pStyle w:val="NormalWeb"/>
-        <w:rPr>
-          <w:color w:val="000000"/>
-        </w:rPr>
-      </w:pPr>
-      <w:r>
-        <w:rPr>
-          <w:color w:val="000000"/>
-        </w:rPr>
-        <w:t>Contract length demonstrates the strongest separation between churn and non-churn groups, suggesting that customer commitment level is a critical behavioural driver. From a business perspective, short-term contracts represent the highest retention priority.</w:t>
-      </w:r>
-    </w:p>
-    <w:p>
-      <w:pPr>
-        <w:pStyle w:val="Heading3"/>
-        <w:rPr>
-          <w:rStyle w:val="Strong"/>
-          <w:rFonts w:cs="Times New Roman"/>
-          <w:color w:val="000000"/>
-          <w:sz w:val="27"/>
-          <w:szCs w:val="27"/>
-        </w:rPr>
-      </w:pPr>
-      <w:r>
-        <w:rPr>
-          <w:rFonts w:eastAsia="Times New Roman" w:cs="Times New Roman"/>
-          <w:b/>
-          <w:bCs/>
-          <w:color w:val="000000"/>
-          <w:sz w:val="27"/>
-          <w:szCs w:val="27"/>
-        </w:rPr>
-        <w:t>2.</w:t>
-      </w:r>
-      <w:r>
-        <w:rPr>
-          <w:rFonts w:eastAsia="Times New Roman" w:cs="Times New Roman"/>
-          <w:b/>
-          <w:bCs/>
-          <w:color w:val="000000"/>
-          <w:sz w:val="27"/>
-          <w:szCs w:val="27"/>
-        </w:rPr>
-        <w:t>6</w:t>
-      </w:r>
-      <w:r>
-        <w:rPr>
-          <w:rFonts w:eastAsia="Times New Roman" w:cs="Times New Roman"/>
-          <w:b/>
-          <w:bCs/>
-          <w:color w:val="000000"/>
-          <w:sz w:val="27"/>
-          <w:szCs w:val="27"/>
-        </w:rPr>
-        <w:t xml:space="preserve"> </w:t>
-      </w:r>
-      <w:r>
-        <w:rPr>
-          <w:rStyle w:val="Strong"/>
-          <w:rFonts w:cs="Times New Roman"/>
-          <w:color w:val="000000"/>
-          <w:sz w:val="27"/>
-          <w:szCs w:val="27"/>
-        </w:rPr>
-        <w:t>Internet Service Differences</w:t>
-      </w:r>
-    </w:p>
-    <w:p>
+        <w:jc w:val="center"/>
+      </w:pPr>
       <w:r>
         <w:rPr>
           <w:noProof/>
         </w:rPr>
         <w:drawing>
-          <wp:inline distT="0" distB="0" distL="0" distR="0" wp14:anchorId="229BDF20" wp14:editId="326914EE">
+          <wp:inline distT="0" distB="0" distL="0" distR="0" wp14:anchorId="61550FE4" wp14:editId="1F80378D">
             <wp:extent cx="5731510" cy="3215005"/>
             <wp:effectExtent l="0" t="0" r="0" b="0"/>
-            <wp:docPr id="1034154982" name="Picture 5" descr="A graph of a number of internet service&#10;&#10;AI-generated content may be incorrect."/>
+            <wp:docPr id="635844195" name="Picture 4" descr="A graph of blue and orange bars&#10;&#10;AI-generated content may be incorrect."/>
             <wp:cNvGraphicFramePr>
               <a:graphicFrameLocks xmlns:a="http://schemas.openxmlformats.org/drawingml/2006/main" noChangeAspect="1"/>
             </wp:cNvGraphicFramePr>
@@ -1598,7 +1423,7 @@
               <a:graphicData uri="http://schemas.openxmlformats.org/drawingml/2006/picture">
                 <pic:pic xmlns:pic="http://schemas.openxmlformats.org/drawingml/2006/picture">
                   <pic:nvPicPr>
-                    <pic:cNvPr id="1034154982" name="Picture 5" descr="A graph of a number of internet service&#10;&#10;AI-generated content may be incorrect."/>
+                    <pic:cNvPr id="635844195" name="Picture 4" descr="A graph of blue and orange bars&#10;&#10;AI-generated content may be incorrect."/>
                     <pic:cNvPicPr/>
                   </pic:nvPicPr>
                   <pic:blipFill>
@@ -1629,34 +1454,37 @@
         </w:drawing>
       </w:r>
     </w:p>
-    <w:p/>
     <w:p>
       <w:pPr>
+        <w:pStyle w:val="NormalWeb"/>
         <w:jc w:val="center"/>
         <w:rPr>
           <w:color w:val="000000"/>
         </w:rPr>
       </w:pPr>
-      <w:r>
-        <w:rPr>
-          <w:color w:val="000000"/>
-        </w:rPr>
-        <w:lastRenderedPageBreak/>
-        <w:t xml:space="preserve">▲ </w:t>
-      </w:r>
-      <w:r>
-        <w:rPr>
-          <w:color w:val="000000"/>
-        </w:rPr>
-        <w:t>(</w:t>
-      </w:r>
       <w:r>
         <w:rPr>
           <w:rStyle w:val="Emphasis"/>
           <w:rFonts w:eastAsiaTheme="majorEastAsia"/>
           <w:color w:val="000000"/>
         </w:rPr>
-        <w:t>06_churn_pct_by_internetservice.png</w:t>
+        <w:t xml:space="preserve">▲ </w:t>
+      </w:r>
+      <w:r>
+        <w:rPr>
+          <w:rStyle w:val="Emphasis"/>
+          <w:rFonts w:eastAsiaTheme="majorEastAsia"/>
+          <w:color w:val="000000"/>
+        </w:rPr>
+        <w:t>(</w:t>
+      </w:r>
+      <w:r>
+        <w:rPr>
+          <w:rStyle w:val="Emphasis"/>
+          <w:rFonts w:eastAsiaTheme="majorEastAsia"/>
+          <w:color w:val="000000"/>
+        </w:rPr>
+        <w:t>05_counts_contract_vs_churn.png</w:t>
       </w:r>
       <w:r>
         <w:rPr>
@@ -1667,25 +1495,154 @@
     </w:p>
     <w:p>
       <w:pPr>
-        <w:jc w:val="center"/>
-        <w:rPr>
-          <w:color w:val="000000"/>
-        </w:rPr>
-      </w:pPr>
+        <w:pStyle w:val="NormalWeb"/>
+        <w:numPr>
+          <w:ilvl w:val="0"/>
+          <w:numId w:val="31"/>
+        </w:numPr>
+        <w:rPr>
+          <w:color w:val="000000"/>
+        </w:rPr>
+      </w:pPr>
+      <w:r>
+        <w:rPr>
+          <w:color w:val="000000"/>
+        </w:rPr>
+        <w:t>Month-to-month:</w:t>
+      </w:r>
+      <w:r>
+        <w:rPr>
+          <w:rStyle w:val="apple-converted-space"/>
+          <w:rFonts w:eastAsiaTheme="majorEastAsia"/>
+          <w:color w:val="000000"/>
+        </w:rPr>
+        <w:t> </w:t>
+      </w:r>
+      <w:r>
+        <w:rPr>
+          <w:rStyle w:val="Strong"/>
+          <w:rFonts w:eastAsiaTheme="majorEastAsia"/>
+          <w:color w:val="000000"/>
+        </w:rPr>
+        <w:t>42.71% churn</w:t>
+      </w:r>
     </w:p>
     <w:p>
       <w:pPr>
-        <w:jc w:val="center"/>
-      </w:pPr>
+        <w:pStyle w:val="NormalWeb"/>
+        <w:numPr>
+          <w:ilvl w:val="0"/>
+          <w:numId w:val="31"/>
+        </w:numPr>
+        <w:rPr>
+          <w:color w:val="000000"/>
+        </w:rPr>
+      </w:pPr>
+      <w:r>
+        <w:rPr>
+          <w:color w:val="000000"/>
+        </w:rPr>
+        <w:t>One-year: 11.27%</w:t>
+      </w:r>
+    </w:p>
+    <w:p>
+      <w:pPr>
+        <w:pStyle w:val="NormalWeb"/>
+        <w:numPr>
+          <w:ilvl w:val="0"/>
+          <w:numId w:val="31"/>
+        </w:numPr>
+        <w:rPr>
+          <w:color w:val="000000"/>
+        </w:rPr>
+      </w:pPr>
+      <w:r>
+        <w:rPr>
+          <w:color w:val="000000"/>
+        </w:rPr>
+        <w:t>Two-year: 2.83%</w:t>
+      </w:r>
+    </w:p>
+    <w:p>
+      <w:pPr>
+        <w:pStyle w:val="NormalWeb"/>
+        <w:rPr>
+          <w:color w:val="000000"/>
+        </w:rPr>
+      </w:pPr>
+      <w:r>
+        <w:rPr>
+          <w:color w:val="000000"/>
+        </w:rPr>
+        <w:lastRenderedPageBreak/>
+        <w:t>Contract length demonstrates the strongest separation between churn and non-churn groups, suggesting that customer commitment level is a critical behavioural driver. From a business perspective, short-term contracts represent the highest retention priority.</w:t>
+      </w:r>
+    </w:p>
+    <w:p>
+      <w:pPr>
+        <w:pStyle w:val="Heading3"/>
+        <w:rPr>
+          <w:rStyle w:val="Strong"/>
+          <w:rFonts w:cs="Times New Roman"/>
+          <w:color w:val="000000"/>
+          <w:sz w:val="27"/>
+          <w:szCs w:val="27"/>
+        </w:rPr>
+      </w:pPr>
+      <w:r>
+        <w:rPr>
+          <w:rFonts w:eastAsia="Times New Roman" w:cs="Times New Roman"/>
+          <w:b/>
+          <w:bCs/>
+          <w:color w:val="000000"/>
+          <w:sz w:val="27"/>
+          <w:szCs w:val="27"/>
+        </w:rPr>
+        <w:t>2.</w:t>
+      </w:r>
+      <w:r>
+        <w:rPr>
+          <w:rFonts w:eastAsia="Times New Roman" w:cs="Times New Roman"/>
+          <w:b/>
+          <w:bCs/>
+          <w:color w:val="000000"/>
+          <w:sz w:val="27"/>
+          <w:szCs w:val="27"/>
+        </w:rPr>
+        <w:t>6</w:t>
+      </w:r>
+      <w:r>
+        <w:rPr>
+          <w:rFonts w:eastAsia="Times New Roman" w:cs="Times New Roman"/>
+          <w:b/>
+          <w:bCs/>
+          <w:color w:val="000000"/>
+          <w:sz w:val="27"/>
+          <w:szCs w:val="27"/>
+        </w:rPr>
+        <w:t xml:space="preserve"> </w:t>
+      </w:r>
+      <w:r>
+        <w:rPr>
+          <w:rStyle w:val="Strong"/>
+          <w:rFonts w:cs="Times New Roman"/>
+          <w:color w:val="000000"/>
+          <w:sz w:val="27"/>
+          <w:szCs w:val="27"/>
+        </w:rPr>
+        <w:t>Internet Service Differences</w:t>
+      </w:r>
+    </w:p>
+    <w:p>
       <w:r>
         <w:rPr>
           <w:noProof/>
         </w:rPr>
         <w:drawing>
-          <wp:inline distT="0" distB="0" distL="0" distR="0" wp14:anchorId="3514B6AD" wp14:editId="579B78FD">
+          <wp:inline distT="0" distB="0" distL="0" distR="0" wp14:anchorId="229BDF20" wp14:editId="43D82DAF">
             <wp:extent cx="5731510" cy="3215005"/>
             <wp:effectExtent l="0" t="0" r="0" b="0"/>
-            <wp:docPr id="1527407208" name="Picture 6" descr="A graph of different colored bars&#10;&#10;AI-generated content may be incorrect."/>
+            <wp:docPr id="1034154982" name="Picture 5" descr="A graph of a number of internet service&#10;&#10;AI-generated content may be incorrect."/>
             <wp:cNvGraphicFramePr>
               <a:graphicFrameLocks xmlns:a="http://schemas.openxmlformats.org/drawingml/2006/main" noChangeAspect="1"/>
             </wp:cNvGraphicFramePr>
@@ -1693,7 +1650,7 @@
               <a:graphicData uri="http://schemas.openxmlformats.org/drawingml/2006/picture">
                 <pic:pic xmlns:pic="http://schemas.openxmlformats.org/drawingml/2006/picture">
                   <pic:nvPicPr>
-                    <pic:cNvPr id="1527407208" name="Picture 6" descr="A graph of different colored bars&#10;&#10;AI-generated content may be incorrect."/>
+                    <pic:cNvPr id="1034154982" name="Picture 5" descr="A graph of a number of internet service&#10;&#10;AI-generated content may be incorrect."/>
                     <pic:cNvPicPr/>
                   </pic:nvPicPr>
                   <pic:blipFill>
@@ -1724,6 +1681,100 @@
         </w:drawing>
       </w:r>
     </w:p>
+    <w:p/>
+    <w:p>
+      <w:pPr>
+        <w:jc w:val="center"/>
+        <w:rPr>
+          <w:color w:val="000000"/>
+        </w:rPr>
+      </w:pPr>
+      <w:r>
+        <w:rPr>
+          <w:color w:val="000000"/>
+        </w:rPr>
+        <w:t xml:space="preserve">▲ </w:t>
+      </w:r>
+      <w:r>
+        <w:rPr>
+          <w:color w:val="000000"/>
+        </w:rPr>
+        <w:t>(</w:t>
+      </w:r>
+      <w:r>
+        <w:rPr>
+          <w:rStyle w:val="Emphasis"/>
+          <w:rFonts w:eastAsiaTheme="majorEastAsia"/>
+          <w:color w:val="000000"/>
+        </w:rPr>
+        <w:t>06_churn_pct_by_internetservice.png</w:t>
+      </w:r>
+      <w:r>
+        <w:rPr>
+          <w:color w:val="000000"/>
+        </w:rPr>
+        <w:t>)</w:t>
+      </w:r>
+    </w:p>
+    <w:p>
+      <w:pPr>
+        <w:jc w:val="center"/>
+        <w:rPr>
+          <w:color w:val="000000"/>
+        </w:rPr>
+      </w:pPr>
+    </w:p>
+    <w:p>
+      <w:pPr>
+        <w:jc w:val="center"/>
+      </w:pPr>
+      <w:r>
+        <w:rPr>
+          <w:noProof/>
+        </w:rPr>
+        <w:drawing>
+          <wp:inline distT="0" distB="0" distL="0" distR="0" wp14:anchorId="3514B6AD" wp14:editId="579B78FD">
+            <wp:extent cx="5731510" cy="3215005"/>
+            <wp:effectExtent l="0" t="0" r="0" b="0"/>
+            <wp:docPr id="1527407208" name="Picture 6" descr="A graph of different colored bars&#10;&#10;AI-generated content may be incorrect."/>
+            <wp:cNvGraphicFramePr>
+              <a:graphicFrameLocks xmlns:a="http://schemas.openxmlformats.org/drawingml/2006/main" noChangeAspect="1"/>
+            </wp:cNvGraphicFramePr>
+            <a:graphic xmlns:a="http://schemas.openxmlformats.org/drawingml/2006/main">
+              <a:graphicData uri="http://schemas.openxmlformats.org/drawingml/2006/picture">
+                <pic:pic xmlns:pic="http://schemas.openxmlformats.org/drawingml/2006/picture">
+                  <pic:nvPicPr>
+                    <pic:cNvPr id="1527407208" name="Picture 6" descr="A graph of different colored bars&#10;&#10;AI-generated content may be incorrect."/>
+                    <pic:cNvPicPr/>
+                  </pic:nvPicPr>
+                  <pic:blipFill>
+                    <a:blip r:embed="rId12" cstate="print">
+                      <a:extLst>
+                        <a:ext uri="{28A0092B-C50C-407E-A947-70E740481C1C}">
+                          <a14:useLocalDpi xmlns:a14="http://schemas.microsoft.com/office/drawing/2010/main" val="0"/>
+                        </a:ext>
+                      </a:extLst>
+                    </a:blip>
+                    <a:stretch>
+                      <a:fillRect/>
+                    </a:stretch>
+                  </pic:blipFill>
+                  <pic:spPr>
+                    <a:xfrm>
+                      <a:off x="0" y="0"/>
+                      <a:ext cx="5731510" cy="3215005"/>
+                    </a:xfrm>
+                    <a:prstGeom prst="rect">
+                      <a:avLst/>
+                    </a:prstGeom>
+                  </pic:spPr>
+                </pic:pic>
+              </a:graphicData>
+            </a:graphic>
+          </wp:inline>
+        </w:drawing>
+      </w:r>
+    </w:p>
     <w:p>
       <w:pPr>
         <w:pStyle w:val="NormalWeb"/>
@@ -1830,6 +1881,7 @@
         <w:rPr>
           <w:color w:val="000000"/>
         </w:rPr>
+        <w:lastRenderedPageBreak/>
         <w:t>No internet: 7.40%</w:t>
       </w:r>
     </w:p>
@@ -2597,7 +2649,6 @@
               <w:rPr>
                 <w:color w:val="000000"/>
               </w:rPr>
-              <w:lastRenderedPageBreak/>
               <w:t>OnlineSecurity</w:t>
             </w:r>
           </w:p>
@@ -3796,7 +3847,7 @@
           <w:noProof/>
           <w14:ligatures w14:val="standardContextual"/>
         </w:rPr>
-        <w:pict w14:anchorId="05F0BDFD">
+        <w:pict w14:anchorId="1671B746">
           <v:rect id="_x0000_i1029" alt="" style="width:451.3pt;height:.05pt;mso-width-percent:0;mso-height-percent:0;mso-width-percent:0;mso-height-percent:0" o:hralign="center" o:hrstd="t" o:hr="t" fillcolor="#a0a0a0" stroked="f"/>
         </w:pict>
       </w:r>
@@ -4079,14 +4130,7 @@
         <w:rPr>
           <w:color w:val="000000"/>
         </w:rPr>
-        <w:t xml:space="preserve">numeric coercion, median </w:t>
-      </w:r>
-      <w:r>
-        <w:rPr>
-          <w:color w:val="000000"/>
-        </w:rPr>
-        <w:lastRenderedPageBreak/>
-        <w:t>imputation for numeric features, most-frequent imputation for categorical features, and one-hot encoding with</w:t>
+        <w:t>numeric coercion, median imputation for numeric features, most-frequent imputation for categorical features, and one-hot encoding with</w:t>
       </w:r>
       <w:r>
         <w:rPr>
@@ -5253,7 +5297,8 @@
           <w:noProof/>
           <w14:ligatures w14:val="standardContextual"/>
         </w:rPr>
-        <w:pict w14:anchorId="5073ECDA">
+        <w:lastRenderedPageBreak/>
+        <w:pict w14:anchorId="64C4BC23">
           <v:rect id="_x0000_i1028" alt="" style="width:451.3pt;height:.05pt;mso-width-percent:0;mso-height-percent:0;mso-width-percent:0;mso-height-percent:0" o:hralign="center" o:hrstd="t" o:hr="t" fillcolor="#a0a0a0" stroked="f"/>
         </w:pict>
       </w:r>
@@ -5456,7 +5501,6 @@
         <w:rPr>
           <w:color w:val="000000"/>
         </w:rPr>
-        <w:lastRenderedPageBreak/>
         <w:t>Cross-validation results indicated that</w:t>
       </w:r>
       <w:r>
@@ -5920,6 +5964,7 @@
               <w:rPr>
                 <w:color w:val="000000"/>
               </w:rPr>
+              <w:lastRenderedPageBreak/>
               <w:t>logreg_balanced</w:t>
             </w:r>
           </w:p>
@@ -6537,7 +6582,6 @@
           <w:iCs/>
           <w:color w:val="000000"/>
         </w:rPr>
-        <w:lastRenderedPageBreak/>
         <w:t xml:space="preserve">▲ </w:t>
       </w:r>
       <w:r>
@@ -6571,7 +6615,7 @@
           <w:noProof/>
           <w14:ligatures w14:val="standardContextual"/>
         </w:rPr>
-        <w:pict w14:anchorId="2471AD8E">
+        <w:pict w14:anchorId="7884706D">
           <v:rect id="_x0000_i1027" alt="" style="width:451.3pt;height:.05pt;mso-width-percent:0;mso-height-percent:0;mso-width-percent:0;mso-height-percent:0" o:hralign="center" o:hrstd="t" o:hr="t" fillcolor="#a0a0a0" stroked="f"/>
         </w:pict>
       </w:r>
@@ -6767,6 +6811,7 @@
         <w:rPr>
           <w:color w:val="000000"/>
         </w:rPr>
+        <w:lastRenderedPageBreak/>
         <w:t>Recall: 0.6872</w:t>
       </w:r>
     </w:p>
@@ -7683,7 +7728,6 @@
                 <w:bCs/>
                 <w:color w:val="000000"/>
               </w:rPr>
-              <w:lastRenderedPageBreak/>
               <w:t>Scenario</w:t>
             </w:r>
           </w:p>
@@ -8580,6 +8624,7 @@
         <w:rPr>
           <w:color w:val="000000"/>
         </w:rPr>
+        <w:lastRenderedPageBreak/>
         <w:t>Probability calibration was assessed using validation and test calibration curves together with the Brier score (0.1374), indicating acceptable probability quality for threshold-based decision-making, while suggesting potential gains from further calibration techniques.</w:t>
       </w:r>
     </w:p>
@@ -9091,7 +9136,7 @@
           <w:noProof/>
           <w14:ligatures w14:val="standardContextual"/>
         </w:rPr>
-        <w:pict w14:anchorId="50427A7C">
+        <w:pict w14:anchorId="6F69B666">
           <v:rect id="_x0000_i1026" alt="" style="width:451.3pt;height:.05pt;mso-width-percent:0;mso-height-percent:0;mso-width-percent:0;mso-height-percent:0" o:hralign="center" o:hrstd="t" o:hr="t" fillcolor="#a0a0a0" stroked="f"/>
         </w:pict>
       </w:r>
@@ -9118,7 +9163,6 @@
           <w:sz w:val="48"/>
           <w:szCs w:val="48"/>
         </w:rPr>
-        <w:lastRenderedPageBreak/>
         <w:t>6. Final Model and Deployment Considerations</w:t>
       </w:r>
     </w:p>
@@ -9429,6 +9473,7 @@
           <w:rFonts w:eastAsiaTheme="majorEastAsia"/>
           <w:color w:val="000000"/>
         </w:rPr>
+        <w:lastRenderedPageBreak/>
         <w:t>Feature coverage:</w:t>
       </w:r>
       <w:r>
@@ -10072,6 +10117,7 @@
           <w:rFonts w:eastAsiaTheme="majorEastAsia"/>
           <w:color w:val="000000"/>
         </w:rPr>
+        <w:lastRenderedPageBreak/>
         <w:t>Caveat:</w:t>
       </w:r>
       <w:r>
@@ -10103,7 +10149,7 @@
           <w:noProof/>
           <w14:ligatures w14:val="standardContextual"/>
         </w:rPr>
-        <w:pict w14:anchorId="173C4807">
+        <w:pict w14:anchorId="3DF09921">
           <v:rect id="_x0000_i1025" alt="" style="width:451.3pt;height:.05pt;mso-width-percent:0;mso-height-percent:0;mso-width-percent:0;mso-height-percent:0" o:hralign="center" o:hrstd="t" o:hr="t" fillcolor="#a0a0a0" stroked="f"/>
         </w:pict>
       </w:r>
@@ -10549,14 +10595,7 @@
               <w:rPr>
                 <w:color w:val="000000"/>
               </w:rPr>
-              <w:t xml:space="preserve">, not actual </w:t>
-            </w:r>
-            <w:r>
-              <w:rPr>
-                <w:color w:val="000000"/>
-              </w:rPr>
-              <w:lastRenderedPageBreak/>
-              <w:t>leakage feature</w:t>
+              <w:t>, not actual leakage feature</w:t>
             </w:r>
           </w:p>
         </w:tc>
@@ -10577,7 +10616,6 @@
               <w:rPr>
                 <w:color w:val="000000"/>
               </w:rPr>
-              <w:lastRenderedPageBreak/>
               <w:t>EDA – Outlier Handling</w:t>
             </w:r>
           </w:p>
@@ -11259,6 +11297,7 @@
               <w:rPr>
                 <w:color w:val="000000"/>
               </w:rPr>
+              <w:lastRenderedPageBreak/>
               <w:t>Hyperparameter Tuning</w:t>
             </w:r>
           </w:p>
@@ -12002,7 +12041,7 @@
                     <pic:cNvPicPr/>
                   </pic:nvPicPr>
                   <pic:blipFill>
-                    <a:blip r:embed="rId12">
+                    <a:blip r:embed="rId13">
                       <a:extLst>
                         <a:ext uri="{28A0092B-C50C-407E-A947-70E740481C1C}">
                           <a14:useLocalDpi xmlns:a14="http://schemas.microsoft.com/office/drawing/2010/main" val="0"/>
@@ -12133,7 +12172,7 @@
         </w:rPr>
         <w:lastRenderedPageBreak/>
         <w:drawing>
-          <wp:inline distT="0" distB="0" distL="0" distR="0" wp14:anchorId="4CEC7FB8" wp14:editId="1DDC95BC">
+          <wp:inline distT="0" distB="0" distL="0" distR="0" wp14:anchorId="4CEC7FB8" wp14:editId="1831A6C9">
             <wp:extent cx="5731510" cy="4767580"/>
             <wp:effectExtent l="0" t="0" r="0" b="0"/>
             <wp:docPr id="705968800" name="Picture 2" descr="A screenshot of a questionnaire&#10;&#10;AI-generated content may be incorrect."/>
@@ -12148,7 +12187,7 @@
                     <pic:cNvPicPr/>
                   </pic:nvPicPr>
                   <pic:blipFill>
-                    <a:blip r:embed="rId13" cstate="print">
+                    <a:blip r:embed="rId14" cstate="print">
                       <a:extLst>
                         <a:ext uri="{28A0092B-C50C-407E-A947-70E740481C1C}">
                           <a14:useLocalDpi xmlns:a14="http://schemas.microsoft.com/office/drawing/2010/main" val="0"/>
@@ -12241,7 +12280,7 @@
         </w:rPr>
         <w:lastRenderedPageBreak/>
         <w:drawing>
-          <wp:inline distT="0" distB="0" distL="0" distR="0" wp14:anchorId="3543D320" wp14:editId="01546613">
+          <wp:inline distT="0" distB="0" distL="0" distR="0" wp14:anchorId="3543D320" wp14:editId="71A669B1">
             <wp:extent cx="5731510" cy="5327650"/>
             <wp:effectExtent l="0" t="0" r="0" b="6350"/>
             <wp:docPr id="2001595283" name="Picture 3" descr="A screenshot of a chat&#10;&#10;AI-generated content may be incorrect."/>
@@ -12256,7 +12295,7 @@
                     <pic:cNvPicPr/>
                   </pic:nvPicPr>
                   <pic:blipFill>
-                    <a:blip r:embed="rId14" cstate="print">
+                    <a:blip r:embed="rId15" cstate="print">
                       <a:extLst>
                         <a:ext uri="{28A0092B-C50C-407E-A947-70E740481C1C}">
                           <a14:useLocalDpi xmlns:a14="http://schemas.microsoft.com/office/drawing/2010/main" val="0"/>
@@ -12368,7 +12407,7 @@
         </w:rPr>
         <w:lastRenderedPageBreak/>
         <w:drawing>
-          <wp:inline distT="0" distB="0" distL="0" distR="0" wp14:anchorId="6C6983D8" wp14:editId="7C165F56">
+          <wp:inline distT="0" distB="0" distL="0" distR="0" wp14:anchorId="6C6983D8" wp14:editId="342B0688">
             <wp:extent cx="5731510" cy="4998720"/>
             <wp:effectExtent l="0" t="0" r="0" b="5080"/>
             <wp:docPr id="590640849" name="Picture 1" descr="A screenshot of a computer&#10;&#10;AI-generated content may be incorrect."/>
@@ -12383,7 +12422,7 @@
                     <pic:cNvPicPr/>
                   </pic:nvPicPr>
                   <pic:blipFill>
-                    <a:blip r:embed="rId15" cstate="print">
+                    <a:blip r:embed="rId16" cstate="print">
                       <a:extLst>
                         <a:ext uri="{28A0092B-C50C-407E-A947-70E740481C1C}">
                           <a14:useLocalDpi xmlns:a14="http://schemas.microsoft.com/office/drawing/2010/main" val="0"/>
@@ -19540,7 +19579,6 @@
     <w:name w:val="Hyperlink"/>
     <w:basedOn w:val="DefaultParagraphFont"/>
     <w:uiPriority w:val="99"/>
-    <w:semiHidden/>
     <w:unhideWhenUsed/>
     <w:rsid w:val="00396E0E"/>
     <w:rPr>
@@ -19584,6 +19622,30 @@
       <w:color w:val="000000"/>
       <w:sz w:val="18"/>
       <w:szCs w:val="18"/>
+    </w:rPr>
+  </w:style>
+  <w:style w:type="character" w:styleId="UnresolvedMention">
+    <w:name w:val="Unresolved Mention"/>
+    <w:basedOn w:val="DefaultParagraphFont"/>
+    <w:uiPriority w:val="99"/>
+    <w:semiHidden/>
+    <w:unhideWhenUsed/>
+    <w:rsid w:val="002052B5"/>
+    <w:rPr>
+      <w:color w:val="605E5C"/>
+      <w:shd w:val="clear" w:color="auto" w:fill="E1DFDD"/>
+    </w:rPr>
+  </w:style>
+  <w:style w:type="character" w:styleId="FollowedHyperlink">
+    <w:name w:val="FollowedHyperlink"/>
+    <w:basedOn w:val="DefaultParagraphFont"/>
+    <w:uiPriority w:val="99"/>
+    <w:semiHidden/>
+    <w:unhideWhenUsed/>
+    <w:rsid w:val="002052B5"/>
+    <w:rPr>
+      <w:color w:val="96607D" w:themeColor="followedHyperlink"/>
+      <w:u w:val="single"/>
     </w:rPr>
   </w:style>
 </w:styles>

</xml_diff>